<commit_message>
Ajout + Update de docs
</commit_message>
<xml_diff>
--- a/docs/Dossier_Projet_Alur_Paris.docx
+++ b/docs/Dossier_Projet_Alur_Paris.docx
@@ -1346,21 +1346,15 @@
         <w:spacing w:after="120" w:line="276" w:lineRule="auto"/>
       </w:pPr>
       <w:r>
-        <w:t>Le projet a été réalisé en PHP orienté objet, avec une architecture MVC développée sans framework, afin de démontrer la maîtrise des mécanismes fondamentaux du développement web : routage, séparation des responsabilités, sécurité et gestion d'une base de données relationnelle.</w:t>
-      </w:r>
-    </w:p>
-    <w:p>
-      <w:pPr>
-        <w:shd w:val="clear" w:color="auto" w:fill="FFF3CD"/>
-        <w:spacing w:after="120" w:line="276" w:lineRule="auto"/>
-      </w:pPr>
-      <w:r>
-        <w:rPr>
-          <w:i/>
-          <w:iCs/>
-          <w:color w:val="856404"/>
-        </w:rPr>
-        <w:t>✏️ À PERSONNALISER — Ajoute 2-3 phrases personnelles : pourquoi ce projet, ce qu'il représente pour toi, l'ambition globale (un e-commerce complet et sécurisé de bout en bout).</w:t>
+        <w:t xml:space="preserve">Le projet a été réalisé en PHP orienté objet, avec une architecture MVC développée sans </w:t>
+      </w:r>
+      <w:proofErr w:type="spellStart"/>
+      <w:r>
+        <w:t>framework</w:t>
+      </w:r>
+      <w:proofErr w:type="spellEnd"/>
+      <w:r>
+        <w:t>, afin de démontrer la maîtrise des mécanismes fondamentaux du développement web : routage, séparation des responsabilités, sécurité et gestion d'une base de données relationnelle.</w:t>
       </w:r>
     </w:p>
     <w:p>
@@ -1526,7 +1520,15 @@
         <w:t xml:space="preserve">Trello : </w:t>
       </w:r>
       <w:r>
-        <w:t>organisation des tâches en tableau Kanban (Backlog / En cours / Terminé).</w:t>
+        <w:t>organisation des tâches en tableau Kanban (</w:t>
+      </w:r>
+      <w:proofErr w:type="spellStart"/>
+      <w:r>
+        <w:t>Backlog</w:t>
+      </w:r>
+      <w:proofErr w:type="spellEnd"/>
+      <w:r>
+        <w:t xml:space="preserve"> / En cours / Terminé).</w:t>
       </w:r>
     </w:p>
     <w:p>
@@ -1545,8 +1547,13 @@
         </w:rPr>
         <w:t xml:space="preserve">Git &amp; GitHub : </w:t>
       </w:r>
-      <w:r>
-        <w:t>versionnement du code et sauvegarde, avec des messages de commit conventionnels (feat, fix, docs).</w:t>
+      <w:proofErr w:type="spellStart"/>
+      <w:r>
+        <w:t>versionnement</w:t>
+      </w:r>
+      <w:proofErr w:type="spellEnd"/>
+      <w:r>
+        <w:t xml:space="preserve"> du code et sauvegarde, avec des messages de commit conventionnels (feat, fix, docs).</w:t>
       </w:r>
     </w:p>
     <w:p>
@@ -1586,21 +1593,37 @@
         <w:t xml:space="preserve">VS Code : </w:t>
       </w:r>
       <w:r>
-        <w:t>éditeur de code.</w:t>
-      </w:r>
-    </w:p>
-    <w:p>
-      <w:pPr>
-        <w:shd w:val="clear" w:color="auto" w:fill="FFF3CD"/>
-        <w:spacing w:after="120" w:line="276" w:lineRule="auto"/>
-      </w:pPr>
-      <w:r>
-        <w:rPr>
-          <w:i/>
-          <w:iCs/>
-          <w:color w:val="856404"/>
-        </w:rPr>
-        <w:t>✏️ À PERSONNALISER — Mentionne ton journal de bord tenu quotidiennement, et renvoie à la capture Trello en annexe.</w:t>
+        <w:t>éditeur de code</w:t>
+      </w:r>
+      <w:r>
+        <w:t xml:space="preserve"> (avec lequel j’ai codé le site, mais en même temps m’a parmi de </w:t>
+      </w:r>
+      <w:proofErr w:type="spellStart"/>
+      <w:r>
+        <w:t>tenier</w:t>
+      </w:r>
+      <w:proofErr w:type="spellEnd"/>
+      <w:r>
+        <w:t xml:space="preserve"> à un journal de bord quotidien en </w:t>
+      </w:r>
+      <w:proofErr w:type="spellStart"/>
+      <w:r>
+        <w:t>Markdown</w:t>
+      </w:r>
+      <w:proofErr w:type="spellEnd"/>
+      <w:r>
+        <w:t xml:space="preserve"> à retrouver sur mon </w:t>
+      </w:r>
+      <w:proofErr w:type="spellStart"/>
+      <w:r>
+        <w:t>github</w:t>
+      </w:r>
+      <w:proofErr w:type="spellEnd"/>
+      <w:r>
+        <w:t>)</w:t>
+      </w:r>
+      <w:r>
+        <w:t>.</w:t>
       </w:r>
     </w:p>
     <w:p>
@@ -1608,6 +1631,16 @@
         <w:pStyle w:val="Titre1"/>
       </w:pPr>
       <w:bookmarkStart w:id="5" w:name="_Toc230356802"/>
+    </w:p>
+    <w:p>
+      <w:pPr>
+        <w:pStyle w:val="Titre1"/>
+      </w:pPr>
+    </w:p>
+    <w:p>
+      <w:pPr>
+        <w:pStyle w:val="Titre1"/>
+      </w:pPr>
       <w:r>
         <w:lastRenderedPageBreak/>
         <w:t>3. Choix techniques justifiés</w:t>
@@ -1629,7 +1662,23 @@
         <w:spacing w:after="120" w:line="276" w:lineRule="auto"/>
       </w:pPr>
       <w:r>
-        <w:t>J'ai choisi de développer en PHP 8 orienté objet avec une architecture MVC (Modèle-Vue-Contrôleur) construite manuellement, plutôt qu'avec un framework existant. Ce choix, plus exigeant, permet de démontrer la compréhension réelle des mécanismes sous-jacents : système de routage, front controller, séparation stricte entre la logique métier, l'affichage et le traitement des requêtes.</w:t>
+        <w:t xml:space="preserve">J'ai choisi de développer en PHP 8 orienté objet avec une architecture MVC (Modèle-Vue-Contrôleur) construite manuellement, plutôt qu'avec un </w:t>
+      </w:r>
+      <w:proofErr w:type="spellStart"/>
+      <w:r>
+        <w:t>framework</w:t>
+      </w:r>
+      <w:proofErr w:type="spellEnd"/>
+      <w:r>
+        <w:t xml:space="preserve"> existant. Ce choix, plus exigeant, permet de démontrer la compréhension réelle des mécanismes sous-jacents : système de routage, front </w:t>
+      </w:r>
+      <w:proofErr w:type="spellStart"/>
+      <w:r>
+        <w:t>controller</w:t>
+      </w:r>
+      <w:proofErr w:type="spellEnd"/>
+      <w:r>
+        <w:t>, séparation stricte entre la logique métier, l'affichage et le traitement des requêtes.</w:t>
       </w:r>
     </w:p>
     <w:p>
@@ -1637,7 +1686,15 @@
         <w:spacing w:after="120" w:line="276" w:lineRule="auto"/>
       </w:pPr>
       <w:r>
-        <w:t>L'architecture est complétée par une couche de Services (logique métier réutilisable : panier, favoris, upload, envoi d'emails) et de Middlewares (filtres de protection des routes selon l'authentification et le rôle de l'utilisateur).</w:t>
+        <w:t xml:space="preserve">L'architecture est complétée par une couche de Services (logique métier réutilisable : panier, favoris, </w:t>
+      </w:r>
+      <w:proofErr w:type="spellStart"/>
+      <w:r>
+        <w:t>upload</w:t>
+      </w:r>
+      <w:proofErr w:type="spellEnd"/>
+      <w:r>
+        <w:t>, envoi d'emails) et de Middlewares (filtres de protection des routes selon l'authentification et le rôle de l'utilisateur).</w:t>
       </w:r>
     </w:p>
     <w:p>
@@ -1663,7 +1720,15 @@
         <w:spacing w:after="120" w:line="276" w:lineRule="auto"/>
       </w:pPr>
       <w:r>
-        <w:t>Une décision clé concerne le « figeage » des données de commande : au moment de l'achat, le nom du produit, son prix et l'adresse de livraison sont copiés dans la commande, plutôt que référencés. Cela préserve l'intégrité de l'historique même si un produit ou un prix est modifié ultérieurement. Le moteur InnoDB a été retenu pour son support des transactions et des clés étrangères.</w:t>
+        <w:t xml:space="preserve">Une décision clé concerne le « figeage » des données de commande : au moment de l'achat, le nom du produit, son prix et l'adresse de livraison sont copiés dans la commande, plutôt que référencés. Cela préserve l'intégrité de l'historique même si un produit ou un prix est modifié ultérieurement. Le moteur </w:t>
+      </w:r>
+      <w:proofErr w:type="spellStart"/>
+      <w:r>
+        <w:t>InnoDB</w:t>
+      </w:r>
+      <w:proofErr w:type="spellEnd"/>
+      <w:r>
+        <w:t xml:space="preserve"> a été retenu pour son support des transactions et des clés étrangères.</w:t>
       </w:r>
     </w:p>
     <w:p>
@@ -1709,7 +1774,23 @@
         <w:t xml:space="preserve">Mots de passe : </w:t>
       </w:r>
       <w:r>
-        <w:t>hachage des mots de passe avec bcrypt (password_hash), jamais de stockage en clair.</w:t>
+        <w:t xml:space="preserve">hachage des mots de passe avec </w:t>
+      </w:r>
+      <w:proofErr w:type="spellStart"/>
+      <w:r>
+        <w:t>bcrypt</w:t>
+      </w:r>
+      <w:proofErr w:type="spellEnd"/>
+      <w:r>
+        <w:t xml:space="preserve"> (</w:t>
+      </w:r>
+      <w:proofErr w:type="spellStart"/>
+      <w:r>
+        <w:t>password_hash</w:t>
+      </w:r>
+      <w:proofErr w:type="spellEnd"/>
+      <w:r>
+        <w:t>), jamais de stockage en clair.</w:t>
       </w:r>
     </w:p>
     <w:p>
@@ -1749,7 +1830,15 @@
         <w:t xml:space="preserve">Anti-XSS : </w:t>
       </w:r>
       <w:r>
-        <w:t>échappement systématique des sorties (htmlspecialchars) pour prévenir les attaques XSS.</w:t>
+        <w:t>échappement systématique des sorties (</w:t>
+      </w:r>
+      <w:proofErr w:type="spellStart"/>
+      <w:r>
+        <w:t>htmlspecialchars</w:t>
+      </w:r>
+      <w:proofErr w:type="spellEnd"/>
+      <w:r>
+        <w:t>) pour prévenir les attaques XSS.</w:t>
       </w:r>
     </w:p>
     <w:p>
@@ -1801,12 +1890,21 @@
         </w:numPr>
         <w:spacing w:after="60" w:line="276" w:lineRule="auto"/>
       </w:pPr>
-      <w:r>
-        <w:rPr>
-          <w:b/>
-          <w:bCs/>
-        </w:rPr>
-        <w:t xml:space="preserve">Upload sécurisé : </w:t>
+      <w:proofErr w:type="spellStart"/>
+      <w:r>
+        <w:rPr>
+          <w:b/>
+          <w:bCs/>
+        </w:rPr>
+        <w:t>Upload</w:t>
+      </w:r>
+      <w:proofErr w:type="spellEnd"/>
+      <w:r>
+        <w:rPr>
+          <w:b/>
+          <w:bCs/>
+        </w:rPr>
+        <w:t xml:space="preserve"> sécurisé : </w:t>
       </w:r>
       <w:r>
         <w:t>vérification du type MIME réel des fichiers (et non de l'extension déclarée), renommage des fichiers, contrôle de la taille.</w:t>
@@ -1827,7 +1925,15 @@
         <w:spacing w:after="120" w:line="276" w:lineRule="auto"/>
       </w:pPr>
       <w:r>
-        <w:t xml:space="preserve">Le paiement est géré via Stripe Checkout, une page de paiement hébergée par Stripe. Ce choix délègue entièrement la conformité PCI-DSS à Stripe : aucune donnée bancaire ne transite par mon serveur. La commande n'est créée en base qu'après confirmation effective du paiement, </w:t>
+        <w:t xml:space="preserve">Le paiement est géré via Stripe </w:t>
+      </w:r>
+      <w:proofErr w:type="spellStart"/>
+      <w:r>
+        <w:t>Checkout</w:t>
+      </w:r>
+      <w:proofErr w:type="spellEnd"/>
+      <w:r>
+        <w:t xml:space="preserve">, une page de paiement hébergée par Stripe. Ce choix délègue entièrement la conformité PCI-DSS à Stripe : aucune donnée bancaire ne transite par mon serveur. La commande n'est créée en base qu'après confirmation effective du paiement, </w:t>
       </w:r>
       <w:r>
         <w:lastRenderedPageBreak/>
@@ -1836,112 +1942,155 @@
     </w:p>
     <w:p>
       <w:pPr>
-        <w:shd w:val="clear" w:color="auto" w:fill="FFF3CD"/>
+        <w:pStyle w:val="Titre2"/>
+      </w:pPr>
+      <w:bookmarkStart w:id="10" w:name="_Toc230356807"/>
+      <w:r>
+        <w:t xml:space="preserve">3.5 </w:t>
+      </w:r>
+      <w:proofErr w:type="spellStart"/>
+      <w:r>
+        <w:t>Front-end</w:t>
+      </w:r>
+      <w:bookmarkEnd w:id="10"/>
+      <w:proofErr w:type="spellEnd"/>
+    </w:p>
+    <w:p>
+      <w:pPr>
         <w:spacing w:after="120" w:line="276" w:lineRule="auto"/>
       </w:pPr>
       <w:r>
-        <w:rPr>
-          <w:i/>
-          <w:iCs/>
-          <w:color w:val="856404"/>
-        </w:rPr>
-        <w:t>✏️ À PERSONNALISER — Optionnel : mentionne que les webhooks Stripe seraient l'évolution naturelle en production pour fiabiliser la confirmation indépendamment du navigateur.</w:t>
-      </w:r>
+        <w:t xml:space="preserve">L'interface utilise </w:t>
+      </w:r>
+      <w:proofErr w:type="spellStart"/>
+      <w:r>
+        <w:t>Tailwind</w:t>
+      </w:r>
+      <w:proofErr w:type="spellEnd"/>
+      <w:r>
+        <w:t xml:space="preserve"> CSS pour un prototypage rapide et une cohérence visuelle, et du JavaScript </w:t>
+      </w:r>
+      <w:proofErr w:type="spellStart"/>
+      <w:r>
+        <w:t>vanilla</w:t>
+      </w:r>
+      <w:proofErr w:type="spellEnd"/>
+      <w:r>
+        <w:t xml:space="preserve"> pour les interactions dynamiques (panier asynchrone via </w:t>
+      </w:r>
+      <w:proofErr w:type="spellStart"/>
+      <w:r>
+        <w:t>fetch</w:t>
+      </w:r>
+      <w:proofErr w:type="spellEnd"/>
+      <w:r>
+        <w:t>/AJAX, galerie d'images, gestion des favoris) sans dépendance externe.</w:t>
+      </w:r>
+    </w:p>
+    <w:p>
+      <w:pPr>
+        <w:pStyle w:val="Titre1"/>
+      </w:pPr>
+      <w:bookmarkStart w:id="11" w:name="_Toc230356808"/>
+      <w:r>
+        <w:t>4. Problématiques rencontrées</w:t>
+      </w:r>
+      <w:bookmarkEnd w:id="11"/>
     </w:p>
     <w:p>
       <w:pPr>
         <w:pStyle w:val="Titre2"/>
       </w:pPr>
-      <w:bookmarkStart w:id="10" w:name="_Toc230356807"/>
-      <w:r>
-        <w:t>3.5 Front-end</w:t>
-      </w:r>
-      <w:bookmarkEnd w:id="10"/>
+      <w:bookmarkStart w:id="12" w:name="_Toc230356809"/>
+      <w:r>
+        <w:t>4.1 Blocage du routage (.</w:t>
+      </w:r>
+      <w:proofErr w:type="spellStart"/>
+      <w:r>
+        <w:t>htaccess</w:t>
+      </w:r>
+      <w:proofErr w:type="spellEnd"/>
+      <w:r>
+        <w:t>)</w:t>
+      </w:r>
+      <w:bookmarkEnd w:id="12"/>
     </w:p>
     <w:p>
       <w:pPr>
         <w:spacing w:after="120" w:line="276" w:lineRule="auto"/>
       </w:pPr>
       <w:r>
-        <w:t>L'interface utilise Tailwind CSS pour un prototypage rapide et une cohérence visuelle, et du JavaScript vanilla pour les interactions dynamiques (panier asynchrone via fetch/AJAX, galerie d'images, gestion des favoris) sans dépendance externe.</w:t>
-      </w:r>
-    </w:p>
-    <w:p>
-      <w:pPr>
-        <w:pStyle w:val="Titre1"/>
-      </w:pPr>
-      <w:bookmarkStart w:id="11" w:name="_Toc230356808"/>
-      <w:r>
-        <w:t>4. Problématiques rencontrées</w:t>
-      </w:r>
-      <w:bookmarkEnd w:id="11"/>
+        <w:t xml:space="preserve">Toutes les URLs renvoyaient une erreur 404 malgré une configuration de réécriture d'URL apparemment correcte. La démarche de diagnostic </w:t>
+      </w:r>
+      <w:r>
+        <w:t>(</w:t>
+      </w:r>
+      <w:r>
+        <w:t>consultation du journal d'erreurs Apache</w:t>
+      </w:r>
+      <w:r>
+        <w:t xml:space="preserve">) </w:t>
+      </w:r>
+      <w:r>
+        <w:t xml:space="preserve">a révélé qu'un fichier de configuration avait été mal généré via le terminal. La résolution est passée par une recréation propre du fichier. Leçon retenue : toujours consulter les logs serveur avant de </w:t>
+      </w:r>
+      <w:r>
+        <w:t>réfléchir à la cause de l’erreur</w:t>
+      </w:r>
+      <w:r>
+        <w:t>.</w:t>
+      </w:r>
     </w:p>
     <w:p>
       <w:pPr>
         <w:pStyle w:val="Titre2"/>
       </w:pPr>
-      <w:bookmarkStart w:id="12" w:name="_Toc230356809"/>
-      <w:r>
-        <w:t>4.1 Blocage du routage (.htaccess)</w:t>
-      </w:r>
-      <w:bookmarkEnd w:id="12"/>
+      <w:bookmarkStart w:id="13" w:name="_Toc230356810"/>
+      <w:r>
+        <w:t>4.2 Corruption de la base au démarrage</w:t>
+      </w:r>
+      <w:bookmarkEnd w:id="13"/>
     </w:p>
     <w:p>
       <w:pPr>
         <w:spacing w:after="120" w:line="276" w:lineRule="auto"/>
       </w:pPr>
       <w:r>
-        <w:t>Toutes les URLs renvoyaient une erreur 404 malgré une configuration de réécriture d'URL apparemment correcte. La démarche de diagnostic — consultation du journal d'erreurs Apache — a révélé qu'un fichier de configuration avait été mal généré via le terminal. La résolution est passée par une recréation propre du fichier. Leçon retenue : toujours consulter les logs serveur avant de tâtonner.</w:t>
+        <w:t xml:space="preserve">Un matin, MySQL refusait de démarrer (« Aria </w:t>
+      </w:r>
+      <w:proofErr w:type="spellStart"/>
+      <w:r>
+        <w:t>recovery</w:t>
+      </w:r>
+      <w:proofErr w:type="spellEnd"/>
+      <w:r>
+        <w:t xml:space="preserve"> </w:t>
+      </w:r>
+      <w:proofErr w:type="spellStart"/>
+      <w:r>
+        <w:t>failed</w:t>
+      </w:r>
+      <w:proofErr w:type="spellEnd"/>
+      <w:r>
+        <w:t xml:space="preserve"> »). Le journal indiquait une corruption des tables système Aria, consécutive à un arrêt non propre de la machine. La suppression des fichiers de log Aria (recréés automatiquement) a résolu le problème sans aucune perte de données. Leçon : arrêter proprement les services avant d'éteindre la machine.</w:t>
       </w:r>
     </w:p>
     <w:p>
       <w:pPr>
         <w:pStyle w:val="Titre2"/>
       </w:pPr>
-      <w:bookmarkStart w:id="13" w:name="_Toc230356810"/>
-      <w:r>
-        <w:t>4.2 Corruption de la base au démarrage</w:t>
-      </w:r>
-      <w:bookmarkEnd w:id="13"/>
+      <w:bookmarkStart w:id="14" w:name="_Toc230356811"/>
+      <w:r>
+        <w:t>4.3 Formulaires HTML imbriqués</w:t>
+      </w:r>
+      <w:bookmarkEnd w:id="14"/>
     </w:p>
     <w:p>
       <w:pPr>
         <w:spacing w:after="120" w:line="276" w:lineRule="auto"/>
       </w:pPr>
       <w:r>
-        <w:t>Un matin, MySQL refusait de démarrer (« Aria recovery failed »). Le journal indiquait une corruption des tables système Aria, consécutive à un arrêt non propre de la machine. La suppression des fichiers de log Aria (recréés automatiquement) a résolu le problème sans aucune perte de données. Leçon : arrêter proprement les services avant d'éteindre la machine.</w:t>
-      </w:r>
-    </w:p>
-    <w:p>
-      <w:pPr>
-        <w:pStyle w:val="Titre2"/>
-      </w:pPr>
-      <w:bookmarkStart w:id="14" w:name="_Toc230356811"/>
-      <w:r>
-        <w:t>4.3 Formulaires HTML imbriqués</w:t>
-      </w:r>
-      <w:bookmarkEnd w:id="14"/>
-    </w:p>
-    <w:p>
-      <w:pPr>
-        <w:spacing w:after="120" w:line="276" w:lineRule="auto"/>
-      </w:pPr>
-      <w:r>
         <w:t>Le bouton d'enregistrement d'un formulaire est devenu inopérant après l'ajout de la gestion d'images. La cause : des balises de formulaire imbriquées (interdit en HTML), ce qui fermait prématurément le formulaire parent. La solution a consisté à séparer les formulaires en éléments distincts.</w:t>
-      </w:r>
-    </w:p>
-    <w:p>
-      <w:pPr>
-        <w:shd w:val="clear" w:color="auto" w:fill="FFF3CD"/>
-        <w:spacing w:after="120" w:line="276" w:lineRule="auto"/>
-      </w:pPr>
-      <w:r>
-        <w:rPr>
-          <w:i/>
-          <w:iCs/>
-          <w:color w:val="856404"/>
-        </w:rPr>
-        <w:t>✏️ À PERSONNALISER — Tu peux ajouter une 4e difficulté qui t'a marqué, ou enrichir celles-ci avec ton ressenti (frustration, satisfaction de la résolution...). C'est valorisé pour la note de réflexivité.</w:t>
       </w:r>
     </w:p>
     <w:p>
@@ -1976,12 +2125,6 @@
         <w:gridCol w:w="6360"/>
       </w:tblGrid>
       <w:tr>
-        <w:tblPrEx>
-          <w:tblCellMar>
-            <w:top w:w="0" w:type="dxa"/>
-            <w:bottom w:w="0" w:type="dxa"/>
-          </w:tblCellMar>
-        </w:tblPrEx>
         <w:tc>
           <w:tcPr>
             <w:tcW w:w="3000" w:type="dxa"/>
@@ -2038,12 +2181,6 @@
         </w:tc>
       </w:tr>
       <w:tr>
-        <w:tblPrEx>
-          <w:tblCellMar>
-            <w:top w:w="0" w:type="dxa"/>
-            <w:bottom w:w="0" w:type="dxa"/>
-          </w:tblCellMar>
-        </w:tblPrEx>
         <w:tc>
           <w:tcPr>
             <w:tcW w:w="3000" w:type="dxa"/>
@@ -2087,22 +2224,18 @@
             </w:tcMar>
           </w:tcPr>
           <w:p>
-            <w:r>
-              <w:rPr>
-                <w:color w:val="856404"/>
-              </w:rPr>
-              <w:t>[COLLE L'URL DE TON DÉPÔT GITHUB]</w:t>
-            </w:r>
+            <w:hyperlink r:id="rId7" w:history="1">
+              <w:r>
+                <w:rPr>
+                  <w:rStyle w:val="Lienhypertexte"/>
+                </w:rPr>
+                <w:t>https://github.com/GuillaumeGOIZET/Alur-Paris</w:t>
+              </w:r>
+            </w:hyperlink>
           </w:p>
         </w:tc>
       </w:tr>
       <w:tr>
-        <w:tblPrEx>
-          <w:tblCellMar>
-            <w:top w:w="0" w:type="dxa"/>
-            <w:bottom w:w="0" w:type="dxa"/>
-          </w:tblCellMar>
-        </w:tblPrEx>
         <w:tc>
           <w:tcPr>
             <w:tcW w:w="3000" w:type="dxa"/>
@@ -2146,22 +2279,18 @@
             </w:tcMar>
           </w:tcPr>
           <w:p>
-            <w:r>
-              <w:rPr>
-                <w:color w:val="856404"/>
-              </w:rPr>
-              <w:t>[COLLE L'URL TRELLO]</w:t>
-            </w:r>
+            <w:hyperlink r:id="rId8" w:history="1">
+              <w:r>
+                <w:rPr>
+                  <w:rStyle w:val="Lienhypertexte"/>
+                </w:rPr>
+                <w:t>https://trello.com/b/f9ixx1ia/kanban-alur-paris</w:t>
+              </w:r>
+            </w:hyperlink>
           </w:p>
         </w:tc>
       </w:tr>
       <w:tr>
-        <w:tblPrEx>
-          <w:tblCellMar>
-            <w:top w:w="0" w:type="dxa"/>
-            <w:bottom w:w="0" w:type="dxa"/>
-          </w:tblCellMar>
-        </w:tblPrEx>
         <w:tc>
           <w:tcPr>
             <w:tcW w:w="3000" w:type="dxa"/>
@@ -2184,7 +2313,7 @@
                 <w:b/>
                 <w:bCs/>
               </w:rPr>
-              <w:t>Maquettes Figma</w:t>
+              <w:t>Journal de bord</w:t>
             </w:r>
           </w:p>
         </w:tc>
@@ -2205,22 +2334,18 @@
             </w:tcMar>
           </w:tcPr>
           <w:p>
-            <w:r>
-              <w:rPr>
-                <w:color w:val="856404"/>
-              </w:rPr>
-              <w:t>[COLLE L'URL FIGMA]</w:t>
-            </w:r>
+            <w:hyperlink r:id="rId9" w:history="1">
+              <w:r>
+                <w:rPr>
+                  <w:rStyle w:val="Lienhypertexte"/>
+                </w:rPr>
+                <w:t>Dossier docs/ du dépôt GitHub</w:t>
+              </w:r>
+            </w:hyperlink>
           </w:p>
         </w:tc>
       </w:tr>
       <w:tr>
-        <w:tblPrEx>
-          <w:tblCellMar>
-            <w:top w:w="0" w:type="dxa"/>
-            <w:bottom w:w="0" w:type="dxa"/>
-          </w:tblCellMar>
-        </w:tblPrEx>
         <w:tc>
           <w:tcPr>
             <w:tcW w:w="3000" w:type="dxa"/>
@@ -2243,8 +2368,7 @@
                 <w:b/>
                 <w:bCs/>
               </w:rPr>
-              <w:lastRenderedPageBreak/>
-              <w:t>Journal de bord</w:t>
+              <w:t>Documents de conception</w:t>
             </w:r>
           </w:p>
         </w:tc>
@@ -2265,65 +2389,14 @@
             </w:tcMar>
           </w:tcPr>
           <w:p>
-            <w:r>
-              <w:t>Dossier docs/ du dépôt GitHub</w:t>
-            </w:r>
-          </w:p>
-        </w:tc>
-      </w:tr>
-      <w:tr>
-        <w:tblPrEx>
-          <w:tblCellMar>
-            <w:top w:w="0" w:type="dxa"/>
-            <w:bottom w:w="0" w:type="dxa"/>
-          </w:tblCellMar>
-        </w:tblPrEx>
-        <w:tc>
-          <w:tcPr>
-            <w:tcW w:w="3000" w:type="dxa"/>
-            <w:tcBorders>
-              <w:top w:val="single" w:sz="1" w:space="0" w:color="CCCCCC"/>
-              <w:left w:val="single" w:sz="1" w:space="0" w:color="CCCCCC"/>
-              <w:bottom w:val="single" w:sz="1" w:space="0" w:color="CCCCCC"/>
-              <w:right w:val="single" w:sz="1" w:space="0" w:color="CCCCCC"/>
-            </w:tcBorders>
-            <w:tcMar>
-              <w:top w:w="80" w:type="dxa"/>
-              <w:left w:w="120" w:type="dxa"/>
-              <w:bottom w:w="80" w:type="dxa"/>
-              <w:right w:w="120" w:type="dxa"/>
-            </w:tcMar>
-          </w:tcPr>
-          <w:p>
-            <w:r>
-              <w:rPr>
-                <w:b/>
-                <w:bCs/>
-              </w:rPr>
-              <w:t>Documents de conception</w:t>
-            </w:r>
-          </w:p>
-        </w:tc>
-        <w:tc>
-          <w:tcPr>
-            <w:tcW w:w="6360" w:type="dxa"/>
-            <w:tcBorders>
-              <w:top w:val="single" w:sz="1" w:space="0" w:color="CCCCCC"/>
-              <w:left w:val="single" w:sz="1" w:space="0" w:color="CCCCCC"/>
-              <w:bottom w:val="single" w:sz="1" w:space="0" w:color="CCCCCC"/>
-              <w:right w:val="single" w:sz="1" w:space="0" w:color="CCCCCC"/>
-            </w:tcBorders>
-            <w:tcMar>
-              <w:top w:w="80" w:type="dxa"/>
-              <w:left w:w="120" w:type="dxa"/>
-              <w:bottom w:w="80" w:type="dxa"/>
-              <w:right w:w="120" w:type="dxa"/>
-            </w:tcMar>
-          </w:tcPr>
-          <w:p>
-            <w:r>
-              <w:t>Cahier des charges, arborescence, MCD, MLD (annexes)</w:t>
-            </w:r>
+            <w:hyperlink r:id="rId10" w:history="1">
+              <w:r>
+                <w:rPr>
+                  <w:rStyle w:val="Lienhypertexte"/>
+                </w:rPr>
+                <w:t>Cahier des charges, arborescence, MCD, MLD (annexes)</w:t>
+              </w:r>
+            </w:hyperlink>
           </w:p>
         </w:tc>
       </w:tr>
@@ -2338,7 +2411,18 @@
         <w:pStyle w:val="Titre1"/>
       </w:pPr>
       <w:bookmarkStart w:id="16" w:name="_Toc230356813"/>
-      <w:r>
+    </w:p>
+    <w:p>
+      <w:pPr>
+        <w:pStyle w:val="Titre1"/>
+      </w:pPr>
+    </w:p>
+    <w:p>
+      <w:pPr>
+        <w:pStyle w:val="Titre1"/>
+      </w:pPr>
+      <w:r>
+        <w:lastRenderedPageBreak/>
         <w:t>6. Conclusion</w:t>
       </w:r>
       <w:bookmarkEnd w:id="16"/>
@@ -2350,19 +2434,14 @@
       <w:r>
         <w:t>Ce projet m'a permis de réaliser un site e-commerce fonctionnel de bout en bout en cinq jours : de la conception de la base de données jusqu'au paiement en ligne et au back-office d'administration.</w:t>
       </w:r>
-    </w:p>
-    <w:p>
-      <w:pPr>
-        <w:shd w:val="clear" w:color="auto" w:fill="FFF3CD"/>
-        <w:spacing w:after="120" w:line="276" w:lineRule="auto"/>
-      </w:pPr>
-      <w:r>
-        <w:rPr>
-          <w:i/>
-          <w:iCs/>
-          <w:color w:val="856404"/>
-        </w:rPr>
-        <w:t>✏️ À PERSONNALISER — RÉDIGE TA CONCLUSION PERSONNELLE (le plus important). Pistes : les compétences que tu as le plus développées, ce que tu retiens de l'autonomie, ce dont tu es fier, ce que tu ferais différemment. 1 à 2 paragraphes sincères.</w:t>
+      <w:r>
+        <w:t xml:space="preserve"> Les compétences que j’ai </w:t>
+      </w:r>
+      <w:r>
+        <w:t xml:space="preserve">le </w:t>
+      </w:r>
+      <w:r>
+        <w:t>plus développer durant cette période a été la gestion de projet web de manière exhaustive (architecture, fichiers de conf, etc…).</w:t>
       </w:r>
     </w:p>
     <w:p>
@@ -2384,8 +2463,13 @@
         </w:numPr>
         <w:spacing w:after="60" w:line="276" w:lineRule="auto"/>
       </w:pPr>
-      <w:r>
-        <w:t>Webhooks Stripe pour fiabiliser la confirmation de paiement en production.</w:t>
+      <w:proofErr w:type="spellStart"/>
+      <w:r>
+        <w:t>Webhooks</w:t>
+      </w:r>
+      <w:proofErr w:type="spellEnd"/>
+      <w:r>
+        <w:t xml:space="preserve"> Stripe pour fiabiliser la confirmation de paiement en production.</w:t>
       </w:r>
     </w:p>
     <w:p>
@@ -2398,7 +2482,7 @@
         <w:spacing w:after="60" w:line="276" w:lineRule="auto"/>
       </w:pPr>
       <w:r>
-        <w:t>Galerie multi-images sur la fiche produit (déjà amorcée) et recadrage avancé.</w:t>
+        <w:t>Réinitialisation de mot de passe par email.</w:t>
       </w:r>
     </w:p>
     <w:p>
@@ -2411,7 +2495,7 @@
         <w:spacing w:after="60" w:line="276" w:lineRule="auto"/>
       </w:pPr>
       <w:r>
-        <w:t>Réinitialisation de mot de passe par email.</w:t>
+        <w:t>Optimisation responsive mobile et accessibilité.</w:t>
       </w:r>
     </w:p>
     <w:p>
@@ -2424,24 +2508,27 @@
         <w:spacing w:after="60" w:line="276" w:lineRule="auto"/>
       </w:pPr>
       <w:r>
-        <w:t>Optimisation responsive mobile et accessibilité.</w:t>
-      </w:r>
-    </w:p>
-    <w:p>
-      <w:pPr>
-        <w:shd w:val="clear" w:color="auto" w:fill="FFF3CD"/>
-        <w:spacing w:after="120" w:line="276" w:lineRule="auto"/>
-      </w:pPr>
-      <w:r>
-        <w:rPr>
-          <w:i/>
-          <w:iCs/>
-          <w:color w:val="856404"/>
-        </w:rPr>
-        <w:t>✏️ À PERSONNALISER — Ajoute / retire des évolutions selon ce que tu veux mettre en avant.</w:t>
-      </w:r>
-    </w:p>
-    <w:p>
+        <w:t xml:space="preserve">Amélioration du visuel global du site (via cette </w:t>
+      </w:r>
+      <w:hyperlink r:id="rId11" w:history="1">
+        <w:r>
+          <w:rPr>
+            <w:rStyle w:val="Lienhypertexte"/>
+          </w:rPr>
+          <w:t xml:space="preserve">maquette </w:t>
+        </w:r>
+        <w:proofErr w:type="spellStart"/>
+        <w:r>
+          <w:rPr>
+            <w:rStyle w:val="Lienhypertexte"/>
+          </w:rPr>
+          <w:t>figma</w:t>
+        </w:r>
+        <w:proofErr w:type="spellEnd"/>
+      </w:hyperlink>
+      <w:r>
+        <w:t>)</w:t>
+      </w:r>
       <w:r>
         <w:br w:type="page"/>
       </w:r>
@@ -2506,46 +2593,504 @@
     </w:p>
     <w:p>
       <w:pPr>
-        <w:pStyle w:val="Paragraphedeliste"/>
-        <w:numPr>
-          <w:ilvl w:val="0"/>
-          <w:numId w:val="2"/>
-        </w:numPr>
-        <w:spacing w:after="60" w:line="276" w:lineRule="auto"/>
-      </w:pPr>
-      <w:r>
-        <w:t>Captures d'écran clés : accueil, fiche produit, tunnel de paiement, back-office.</w:t>
-      </w:r>
-    </w:p>
-    <w:p>
-      <w:pPr>
-        <w:pStyle w:val="Paragraphedeliste"/>
-        <w:numPr>
-          <w:ilvl w:val="0"/>
-          <w:numId w:val="2"/>
-        </w:numPr>
-        <w:spacing w:after="60" w:line="276" w:lineRule="auto"/>
-      </w:pPr>
-      <w:r>
-        <w:t>Extraits de code significatifs (transaction de commande, upload sécurisé, middleware).</w:t>
+        <w:spacing w:after="60" w:line="276" w:lineRule="auto"/>
+        <w:ind w:left="280"/>
+        <w:jc w:val="center"/>
+        <w:rPr>
+          <w:b/>
+          <w:bCs/>
+        </w:rPr>
+      </w:pPr>
+      <w:r>
+        <w:rPr>
+          <w:b/>
+          <w:bCs/>
+        </w:rPr>
+        <w:t>MCD :</w:t>
       </w:r>
     </w:p>
     <w:p>
       <w:pPr>
         <w:shd w:val="clear" w:color="auto" w:fill="FFF3CD"/>
         <w:spacing w:after="120" w:line="276" w:lineRule="auto"/>
-      </w:pPr>
-      <w:r>
         <w:rPr>
           <w:i/>
           <w:iCs/>
           <w:color w:val="856404"/>
         </w:rPr>
-        <w:t>✏️ À PERSONNALISER — Insère ici tes captures (glisser-déposer dans Word). Le dossier de 8 pages se compte HORS annexes, tu as donc de la marge.</w:t>
-      </w:r>
+      </w:pPr>
+      <w:r>
+        <w:rPr>
+          <w:noProof/>
+        </w:rPr>
+        <w:drawing>
+          <wp:inline distT="0" distB="0" distL="0" distR="0" wp14:anchorId="2B974AFA" wp14:editId="24CD85FD">
+            <wp:extent cx="5992586" cy="5305675"/>
+            <wp:effectExtent l="0" t="0" r="8255" b="9525"/>
+            <wp:docPr id="778718069" name="Image 1"/>
+            <wp:cNvGraphicFramePr>
+              <a:graphicFrameLocks xmlns:a="http://schemas.openxmlformats.org/drawingml/2006/main" noChangeAspect="1"/>
+            </wp:cNvGraphicFramePr>
+            <a:graphic xmlns:a="http://schemas.openxmlformats.org/drawingml/2006/main">
+              <a:graphicData uri="http://schemas.openxmlformats.org/drawingml/2006/picture">
+                <pic:pic xmlns:pic="http://schemas.openxmlformats.org/drawingml/2006/picture">
+                  <pic:nvPicPr>
+                    <pic:cNvPr id="778718069" name=""/>
+                    <pic:cNvPicPr/>
+                  </pic:nvPicPr>
+                  <pic:blipFill>
+                    <a:blip r:embed="rId12"/>
+                    <a:stretch>
+                      <a:fillRect/>
+                    </a:stretch>
+                  </pic:blipFill>
+                  <pic:spPr>
+                    <a:xfrm>
+                      <a:off x="0" y="0"/>
+                      <a:ext cx="6005868" cy="5317435"/>
+                    </a:xfrm>
+                    <a:prstGeom prst="rect">
+                      <a:avLst/>
+                    </a:prstGeom>
+                  </pic:spPr>
+                </pic:pic>
+              </a:graphicData>
+            </a:graphic>
+          </wp:inline>
+        </w:drawing>
+      </w:r>
+    </w:p>
+    <w:p>
+      <w:pPr>
+        <w:spacing w:after="60" w:line="276" w:lineRule="auto"/>
+        <w:ind w:left="280"/>
+        <w:jc w:val="center"/>
+      </w:pPr>
+      <w:r>
+        <w:br/>
+      </w:r>
+      <w:r>
+        <w:br/>
+      </w:r>
+    </w:p>
+    <w:p>
+      <w:pPr>
+        <w:spacing w:after="60" w:line="276" w:lineRule="auto"/>
+        <w:ind w:left="280"/>
+        <w:jc w:val="center"/>
+      </w:pPr>
+    </w:p>
+    <w:p>
+      <w:pPr>
+        <w:spacing w:after="60" w:line="276" w:lineRule="auto"/>
+        <w:ind w:left="280"/>
+        <w:jc w:val="center"/>
+      </w:pPr>
+    </w:p>
+    <w:p>
+      <w:pPr>
+        <w:spacing w:after="60" w:line="276" w:lineRule="auto"/>
+        <w:ind w:left="280"/>
+        <w:jc w:val="center"/>
+        <w:rPr>
+          <w:b/>
+          <w:bCs/>
+        </w:rPr>
+      </w:pPr>
+      <w:r>
+        <w:rPr>
+          <w:b/>
+          <w:bCs/>
+          <w:noProof/>
+        </w:rPr>
+        <w:lastRenderedPageBreak/>
+        <w:drawing>
+          <wp:anchor distT="0" distB="0" distL="114300" distR="114300" simplePos="0" relativeHeight="251659264" behindDoc="1" locked="0" layoutInCell="1" allowOverlap="1" wp14:anchorId="22887006" wp14:editId="34AC600A">
+            <wp:simplePos x="0" y="0"/>
+            <wp:positionH relativeFrom="margin">
+              <wp:posOffset>-673959</wp:posOffset>
+            </wp:positionH>
+            <wp:positionV relativeFrom="paragraph">
+              <wp:posOffset>185057</wp:posOffset>
+            </wp:positionV>
+            <wp:extent cx="7280499" cy="4294414"/>
+            <wp:effectExtent l="0" t="0" r="0" b="0"/>
+            <wp:wrapNone/>
+            <wp:docPr id="1286857723" name="Image 1"/>
+            <wp:cNvGraphicFramePr>
+              <a:graphicFrameLocks xmlns:a="http://schemas.openxmlformats.org/drawingml/2006/main" noChangeAspect="1"/>
+            </wp:cNvGraphicFramePr>
+            <a:graphic xmlns:a="http://schemas.openxmlformats.org/drawingml/2006/main">
+              <a:graphicData uri="http://schemas.openxmlformats.org/drawingml/2006/picture">
+                <pic:pic xmlns:pic="http://schemas.openxmlformats.org/drawingml/2006/picture">
+                  <pic:nvPicPr>
+                    <pic:cNvPr id="1286857723" name=""/>
+                    <pic:cNvPicPr/>
+                  </pic:nvPicPr>
+                  <pic:blipFill>
+                    <a:blip r:embed="rId13" cstate="print">
+                      <a:extLst>
+                        <a:ext uri="{28A0092B-C50C-407E-A947-70E740481C1C}">
+                          <a14:useLocalDpi xmlns:a14="http://schemas.microsoft.com/office/drawing/2010/main" val="0"/>
+                        </a:ext>
+                      </a:extLst>
+                    </a:blip>
+                    <a:stretch>
+                      <a:fillRect/>
+                    </a:stretch>
+                  </pic:blipFill>
+                  <pic:spPr>
+                    <a:xfrm>
+                      <a:off x="0" y="0"/>
+                      <a:ext cx="7292648" cy="4301580"/>
+                    </a:xfrm>
+                    <a:prstGeom prst="rect">
+                      <a:avLst/>
+                    </a:prstGeom>
+                  </pic:spPr>
+                </pic:pic>
+              </a:graphicData>
+            </a:graphic>
+            <wp14:sizeRelH relativeFrom="margin">
+              <wp14:pctWidth>0</wp14:pctWidth>
+            </wp14:sizeRelH>
+            <wp14:sizeRelV relativeFrom="margin">
+              <wp14:pctHeight>0</wp14:pctHeight>
+            </wp14:sizeRelV>
+          </wp:anchor>
+        </w:drawing>
+      </w:r>
+      <w:r>
+        <w:rPr>
+          <w:b/>
+          <w:bCs/>
+        </w:rPr>
+        <w:t>MLD :</w:t>
+      </w:r>
+      <w:r>
+        <w:rPr>
+          <w:b/>
+          <w:bCs/>
+        </w:rPr>
+        <w:br/>
+      </w:r>
+    </w:p>
+    <w:p>
+      <w:pPr>
+        <w:spacing w:after="60" w:line="276" w:lineRule="auto"/>
+        <w:ind w:left="280"/>
+        <w:jc w:val="center"/>
+        <w:rPr>
+          <w:b/>
+          <w:bCs/>
+        </w:rPr>
+      </w:pPr>
+    </w:p>
+    <w:p>
+      <w:pPr>
+        <w:spacing w:after="60" w:line="276" w:lineRule="auto"/>
+        <w:ind w:left="280"/>
+        <w:jc w:val="center"/>
+        <w:rPr>
+          <w:b/>
+          <w:bCs/>
+        </w:rPr>
+      </w:pPr>
+    </w:p>
+    <w:p>
+      <w:pPr>
+        <w:spacing w:after="60" w:line="276" w:lineRule="auto"/>
+        <w:ind w:left="280"/>
+        <w:jc w:val="center"/>
+        <w:rPr>
+          <w:b/>
+          <w:bCs/>
+        </w:rPr>
+      </w:pPr>
+    </w:p>
+    <w:p>
+      <w:pPr>
+        <w:spacing w:after="60" w:line="276" w:lineRule="auto"/>
+        <w:ind w:left="280"/>
+        <w:jc w:val="center"/>
+        <w:rPr>
+          <w:b/>
+          <w:bCs/>
+        </w:rPr>
+      </w:pPr>
+    </w:p>
+    <w:p>
+      <w:pPr>
+        <w:spacing w:after="60" w:line="276" w:lineRule="auto"/>
+        <w:ind w:left="280"/>
+        <w:jc w:val="center"/>
+        <w:rPr>
+          <w:b/>
+          <w:bCs/>
+        </w:rPr>
+      </w:pPr>
+    </w:p>
+    <w:p>
+      <w:pPr>
+        <w:spacing w:after="60" w:line="276" w:lineRule="auto"/>
+        <w:ind w:left="280"/>
+        <w:jc w:val="center"/>
+        <w:rPr>
+          <w:b/>
+          <w:bCs/>
+        </w:rPr>
+      </w:pPr>
+    </w:p>
+    <w:p>
+      <w:pPr>
+        <w:spacing w:after="60" w:line="276" w:lineRule="auto"/>
+        <w:ind w:left="280"/>
+        <w:jc w:val="center"/>
+        <w:rPr>
+          <w:b/>
+          <w:bCs/>
+        </w:rPr>
+      </w:pPr>
+    </w:p>
+    <w:p>
+      <w:pPr>
+        <w:spacing w:after="60" w:line="276" w:lineRule="auto"/>
+        <w:ind w:left="280"/>
+        <w:jc w:val="center"/>
+        <w:rPr>
+          <w:b/>
+          <w:bCs/>
+        </w:rPr>
+      </w:pPr>
+    </w:p>
+    <w:p>
+      <w:pPr>
+        <w:spacing w:after="60" w:line="276" w:lineRule="auto"/>
+        <w:ind w:left="280"/>
+        <w:jc w:val="center"/>
+        <w:rPr>
+          <w:b/>
+          <w:bCs/>
+        </w:rPr>
+      </w:pPr>
+    </w:p>
+    <w:p>
+      <w:pPr>
+        <w:spacing w:after="60" w:line="276" w:lineRule="auto"/>
+        <w:ind w:left="280"/>
+        <w:jc w:val="center"/>
+        <w:rPr>
+          <w:b/>
+          <w:bCs/>
+        </w:rPr>
+      </w:pPr>
+    </w:p>
+    <w:p>
+      <w:pPr>
+        <w:spacing w:after="60" w:line="276" w:lineRule="auto"/>
+        <w:ind w:left="280"/>
+        <w:jc w:val="center"/>
+        <w:rPr>
+          <w:b/>
+          <w:bCs/>
+        </w:rPr>
+      </w:pPr>
+    </w:p>
+    <w:p>
+      <w:pPr>
+        <w:spacing w:after="60" w:line="276" w:lineRule="auto"/>
+        <w:ind w:left="280"/>
+        <w:jc w:val="center"/>
+        <w:rPr>
+          <w:b/>
+          <w:bCs/>
+        </w:rPr>
+      </w:pPr>
+    </w:p>
+    <w:p>
+      <w:pPr>
+        <w:spacing w:after="60" w:line="276" w:lineRule="auto"/>
+        <w:ind w:left="280"/>
+        <w:jc w:val="center"/>
+        <w:rPr>
+          <w:b/>
+          <w:bCs/>
+        </w:rPr>
+      </w:pPr>
+    </w:p>
+    <w:p>
+      <w:pPr>
+        <w:spacing w:after="60" w:line="276" w:lineRule="auto"/>
+        <w:ind w:left="280"/>
+        <w:jc w:val="center"/>
+        <w:rPr>
+          <w:b/>
+          <w:bCs/>
+        </w:rPr>
+      </w:pPr>
+    </w:p>
+    <w:p>
+      <w:pPr>
+        <w:spacing w:after="60" w:line="276" w:lineRule="auto"/>
+        <w:ind w:left="280"/>
+        <w:jc w:val="center"/>
+        <w:rPr>
+          <w:b/>
+          <w:bCs/>
+        </w:rPr>
+      </w:pPr>
+    </w:p>
+    <w:p>
+      <w:pPr>
+        <w:spacing w:after="60" w:line="276" w:lineRule="auto"/>
+        <w:ind w:left="280"/>
+        <w:jc w:val="center"/>
+        <w:rPr>
+          <w:b/>
+          <w:bCs/>
+        </w:rPr>
+      </w:pPr>
+    </w:p>
+    <w:p>
+      <w:pPr>
+        <w:spacing w:after="60" w:line="276" w:lineRule="auto"/>
+        <w:ind w:left="280"/>
+        <w:jc w:val="center"/>
+        <w:rPr>
+          <w:b/>
+          <w:bCs/>
+        </w:rPr>
+      </w:pPr>
+    </w:p>
+    <w:p>
+      <w:pPr>
+        <w:spacing w:after="60" w:line="276" w:lineRule="auto"/>
+        <w:ind w:left="280"/>
+        <w:jc w:val="center"/>
+        <w:rPr>
+          <w:b/>
+          <w:bCs/>
+        </w:rPr>
+      </w:pPr>
+    </w:p>
+    <w:p>
+      <w:pPr>
+        <w:spacing w:after="60" w:line="276" w:lineRule="auto"/>
+        <w:ind w:left="280"/>
+        <w:jc w:val="center"/>
+        <w:rPr>
+          <w:b/>
+          <w:bCs/>
+        </w:rPr>
+      </w:pPr>
+    </w:p>
+    <w:p>
+      <w:pPr>
+        <w:spacing w:after="60" w:line="276" w:lineRule="auto"/>
+        <w:ind w:left="280"/>
+        <w:jc w:val="center"/>
+        <w:rPr>
+          <w:b/>
+          <w:bCs/>
+        </w:rPr>
+      </w:pPr>
+      <w:r>
+        <w:rPr>
+          <w:b/>
+          <w:bCs/>
+          <w:noProof/>
+        </w:rPr>
+        <w:drawing>
+          <wp:anchor distT="0" distB="0" distL="114300" distR="114300" simplePos="0" relativeHeight="251660288" behindDoc="1" locked="0" layoutInCell="1" allowOverlap="1" wp14:anchorId="5B53DC91" wp14:editId="3ED15868">
+            <wp:simplePos x="0" y="0"/>
+            <wp:positionH relativeFrom="page">
+              <wp:posOffset>171722</wp:posOffset>
+            </wp:positionH>
+            <wp:positionV relativeFrom="paragraph">
+              <wp:posOffset>268151</wp:posOffset>
+            </wp:positionV>
+            <wp:extent cx="7386335" cy="3494314"/>
+            <wp:effectExtent l="0" t="0" r="5080" b="0"/>
+            <wp:wrapNone/>
+            <wp:docPr id="1730353913" name="Image 1"/>
+            <wp:cNvGraphicFramePr>
+              <a:graphicFrameLocks xmlns:a="http://schemas.openxmlformats.org/drawingml/2006/main" noChangeAspect="1"/>
+            </wp:cNvGraphicFramePr>
+            <a:graphic xmlns:a="http://schemas.openxmlformats.org/drawingml/2006/main">
+              <a:graphicData uri="http://schemas.openxmlformats.org/drawingml/2006/picture">
+                <pic:pic xmlns:pic="http://schemas.openxmlformats.org/drawingml/2006/picture">
+                  <pic:nvPicPr>
+                    <pic:cNvPr id="1730353913" name=""/>
+                    <pic:cNvPicPr/>
+                  </pic:nvPicPr>
+                  <pic:blipFill>
+                    <a:blip r:embed="rId14" cstate="print">
+                      <a:extLst>
+                        <a:ext uri="{28A0092B-C50C-407E-A947-70E740481C1C}">
+                          <a14:useLocalDpi xmlns:a14="http://schemas.microsoft.com/office/drawing/2010/main" val="0"/>
+                        </a:ext>
+                      </a:extLst>
+                    </a:blip>
+                    <a:stretch>
+                      <a:fillRect/>
+                    </a:stretch>
+                  </pic:blipFill>
+                  <pic:spPr>
+                    <a:xfrm>
+                      <a:off x="0" y="0"/>
+                      <a:ext cx="7386335" cy="3494314"/>
+                    </a:xfrm>
+                    <a:prstGeom prst="rect">
+                      <a:avLst/>
+                    </a:prstGeom>
+                  </pic:spPr>
+                </pic:pic>
+              </a:graphicData>
+            </a:graphic>
+            <wp14:sizeRelH relativeFrom="margin">
+              <wp14:pctWidth>0</wp14:pctWidth>
+            </wp14:sizeRelH>
+            <wp14:sizeRelV relativeFrom="margin">
+              <wp14:pctHeight>0</wp14:pctHeight>
+            </wp14:sizeRelV>
+          </wp:anchor>
+        </w:drawing>
+      </w:r>
+      <w:r>
+        <w:rPr>
+          <w:b/>
+          <w:bCs/>
+        </w:rPr>
+        <w:t>Kanban (Trello)</w:t>
+      </w:r>
+      <w:r>
+        <w:rPr>
+          <w:b/>
+          <w:bCs/>
+        </w:rPr>
+        <w:t> :</w:t>
+      </w:r>
+      <w:r>
+        <w:rPr>
+          <w:b/>
+          <w:bCs/>
+        </w:rPr>
+        <w:br/>
+      </w:r>
+    </w:p>
+    <w:p>
+      <w:pPr>
+        <w:spacing w:after="60" w:line="276" w:lineRule="auto"/>
+        <w:ind w:left="280"/>
+        <w:jc w:val="center"/>
+        <w:rPr>
+          <w:b/>
+          <w:bCs/>
+        </w:rPr>
+      </w:pPr>
     </w:p>
     <w:sectPr>
-      <w:footerReference w:type="default" r:id="rId7"/>
+      <w:footerReference w:type="default" r:id="rId15"/>
       <w:pgSz w:w="12240" w:h="15840"/>
       <w:pgMar w:top="1440" w:right="1440" w:bottom="1440" w:left="1440" w:header="708" w:footer="708" w:gutter="0"/>
       <w:cols w:space="720"/>
@@ -3203,6 +3748,7 @@
   <w:style w:type="paragraph" w:default="1" w:styleId="Normal">
     <w:name w:val="Normal"/>
     <w:qFormat/>
+    <w:rsid w:val="00556070"/>
   </w:style>
   <w:style w:type="paragraph" w:styleId="Titre1">
     <w:name w:val="heading 1"/>
@@ -3439,6 +3985,18 @@
       <w:spacing w:after="100"/>
       <w:ind w:left="220"/>
     </w:pPr>
+  </w:style>
+  <w:style w:type="character" w:styleId="Mentionnonrsolue">
+    <w:name w:val="Unresolved Mention"/>
+    <w:basedOn w:val="Policepardfaut"/>
+    <w:uiPriority w:val="99"/>
+    <w:semiHidden/>
+    <w:unhideWhenUsed/>
+    <w:rsid w:val="00BE7A06"/>
+    <w:rPr>
+      <w:color w:val="605E5C"/>
+      <w:shd w:val="clear" w:color="auto" w:fill="E1DFDD"/>
+    </w:rPr>
   </w:style>
 </w:styles>
 </file>

</xml_diff>